<commit_message>
Propuestas economicas 215088 y 215116: dejar solo la nota de ITBMS
Las otras cinco vinetas del bloque de condiciones no las exige el pliego
y duplicaban datos que ya van en las propuestas tecnicas. Una (el acuse
de enmiendas) solo aplica a contrataciones de obras, y la de condiciones
de pago citaba clausulas sin verificar.

Co-Authored-By: Claude Opus 5 <noreply@anthropic.com>
Claude-Session: https://claude.ai/code/session_01EKNGokwqz1csBHm9s8jAFm
</commit_message>
<xml_diff>
--- a/licitaciones/215088-guantes-acp/word/PROPUESTA-ECONOMICA-215088.docx
+++ b/licitaciones/215088-guantes-acp/word/PROPUESTA-ECONOMICA-215088.docx
@@ -4748,7 +4748,7 @@
           <w:sz w:val="22"/>
           <w:szCs w:val="22"/>
         </w:rPr>
-        <w:t xml:space="preserve">Condiciones aplicables a todos los renglones</w:t>
+        <w:t xml:space="preserve">Nota sobre el precio ofertado</w:t>
       </w:r>
     </w:p>
     <w:tbl>
@@ -4841,396 +4841,6 @@
                 <w:szCs w:val="17"/>
               </w:rPr>
               <w:t xml:space="preserve">El precio ofertado NO incluye ITBMS ni impuestos de importación, conforme a la cláusula 4.28.6 del pliego de cargos único: la Autoridad del Canal de Panamá está exenta de dichos tributos.</w:t>
-            </w:r>
-          </w:p>
-        </w:tc>
-      </w:tr>
-      <w:tr>
-        <w:tc>
-          <w:tcPr>
-            <w:tcW w:type="dxa" w:w="300"/>
-            <w:tcBorders>
-              <w:top w:val="none" w:color="FFFFFF" w:sz="0"/>
-              <w:left w:val="none" w:color="FFFFFF" w:sz="0"/>
-              <w:bottom w:val="none" w:color="FFFFFF" w:sz="0"/>
-              <w:right w:val="none" w:color="FFFFFF" w:sz="0"/>
-            </w:tcBorders>
-            <w:tcMar>
-              <w:top w:type="dxa" w:w="80"/>
-              <w:left w:type="dxa" w:w="130"/>
-              <w:bottom w:type="dxa" w:w="80"/>
-              <w:right w:type="dxa" w:w="130"/>
-            </w:tcMar>
-            <w:vAlign w:val="top"/>
-          </w:tcPr>
-          <w:p>
-            <w:pPr>
-              <w:spacing w:after="20" w:before="20"/>
-              <w:jc w:val="left"/>
-            </w:pPr>
-            <w:r>
-              <w:rPr>
-                <w:rFonts w:ascii="Arial" w:cs="Arial" w:eastAsia="Arial" w:hAnsi="Arial"/>
-                <w:b w:val="false"/>
-                <w:bCs w:val="false"/>
-                <w:i w:val="false"/>
-                <w:iCs w:val="false"/>
-                <w:caps w:val="false"/>
-                <w:color w:val="EB5A2D"/>
-                <w:sz w:val="12"/>
-                <w:szCs w:val="12"/>
-              </w:rPr>
-              <w:t xml:space="preserve">■</w:t>
-            </w:r>
-          </w:p>
-        </w:tc>
-        <w:tc>
-          <w:tcPr>
-            <w:tcW w:type="dxa" w:w="10500"/>
-            <w:tcBorders>
-              <w:top w:val="none" w:color="FFFFFF" w:sz="0"/>
-              <w:left w:val="none" w:color="FFFFFF" w:sz="0"/>
-              <w:bottom w:val="none" w:color="FFFFFF" w:sz="0"/>
-              <w:right w:val="none" w:color="FFFFFF" w:sz="0"/>
-            </w:tcBorders>
-            <w:tcMar>
-              <w:top w:type="dxa" w:w="80"/>
-              <w:left w:type="dxa" w:w="130"/>
-              <w:bottom w:type="dxa" w:w="80"/>
-              <w:right w:type="dxa" w:w="130"/>
-            </w:tcMar>
-            <w:vAlign w:val="top"/>
-          </w:tcPr>
-          <w:p>
-            <w:pPr>
-              <w:spacing w:after="20" w:before="20"/>
-              <w:jc w:val="both"/>
-            </w:pPr>
-            <w:r>
-              <w:rPr>
-                <w:rFonts w:ascii="Arial" w:cs="Arial" w:eastAsia="Arial" w:hAnsi="Arial"/>
-                <w:b w:val="false"/>
-                <w:bCs w:val="false"/>
-                <w:i w:val="false"/>
-                <w:iCs w:val="false"/>
-                <w:caps w:val="false"/>
-                <w:color w:val="1A1A1A"/>
-                <w:sz w:val="17"/>
-                <w:szCs w:val="17"/>
-              </w:rPr>
-              <w:t xml:space="preserve">El precio unitario absorbe el flete, el seguro, la declaración simplificada de aduanas y su costo, la descarga de los bienes y su colocación en sitio, conforme al término DAP Panamá del numeral 3.2.</w:t>
-            </w:r>
-          </w:p>
-        </w:tc>
-      </w:tr>
-      <w:tr>
-        <w:tc>
-          <w:tcPr>
-            <w:tcW w:type="dxa" w:w="300"/>
-            <w:tcBorders>
-              <w:top w:val="none" w:color="FFFFFF" w:sz="0"/>
-              <w:left w:val="none" w:color="FFFFFF" w:sz="0"/>
-              <w:bottom w:val="none" w:color="FFFFFF" w:sz="0"/>
-              <w:right w:val="none" w:color="FFFFFF" w:sz="0"/>
-            </w:tcBorders>
-            <w:tcMar>
-              <w:top w:type="dxa" w:w="80"/>
-              <w:left w:type="dxa" w:w="130"/>
-              <w:bottom w:type="dxa" w:w="80"/>
-              <w:right w:type="dxa" w:w="130"/>
-            </w:tcMar>
-            <w:vAlign w:val="top"/>
-          </w:tcPr>
-          <w:p>
-            <w:pPr>
-              <w:spacing w:after="20" w:before="20"/>
-              <w:jc w:val="left"/>
-            </w:pPr>
-            <w:r>
-              <w:rPr>
-                <w:rFonts w:ascii="Arial" w:cs="Arial" w:eastAsia="Arial" w:hAnsi="Arial"/>
-                <w:b w:val="false"/>
-                <w:bCs w:val="false"/>
-                <w:i w:val="false"/>
-                <w:iCs w:val="false"/>
-                <w:caps w:val="false"/>
-                <w:color w:val="EB5A2D"/>
-                <w:sz w:val="12"/>
-                <w:szCs w:val="12"/>
-              </w:rPr>
-              <w:t xml:space="preserve">■</w:t>
-            </w:r>
-          </w:p>
-        </w:tc>
-        <w:tc>
-          <w:tcPr>
-            <w:tcW w:type="dxa" w:w="10500"/>
-            <w:tcBorders>
-              <w:top w:val="none" w:color="FFFFFF" w:sz="0"/>
-              <w:left w:val="none" w:color="FFFFFF" w:sz="0"/>
-              <w:bottom w:val="none" w:color="FFFFFF" w:sz="0"/>
-              <w:right w:val="none" w:color="FFFFFF" w:sz="0"/>
-            </w:tcBorders>
-            <w:tcMar>
-              <w:top w:type="dxa" w:w="80"/>
-              <w:left w:type="dxa" w:w="130"/>
-              <w:bottom w:type="dxa" w:w="80"/>
-              <w:right w:type="dxa" w:w="130"/>
-            </w:tcMar>
-            <w:vAlign w:val="top"/>
-          </w:tcPr>
-          <w:p>
-            <w:pPr>
-              <w:spacing w:after="20" w:before="20"/>
-              <w:jc w:val="both"/>
-            </w:pPr>
-            <w:r>
-              <w:rPr>
-                <w:rFonts w:ascii="Arial" w:cs="Arial" w:eastAsia="Arial" w:hAnsi="Arial"/>
-                <w:b w:val="false"/>
-                <w:bCs w:val="false"/>
-                <w:i w:val="false"/>
-                <w:iCs w:val="false"/>
-                <w:caps w:val="false"/>
-                <w:color w:val="1A1A1A"/>
-                <w:sz w:val="17"/>
-                <w:szCs w:val="17"/>
-              </w:rPr>
-              <w:t xml:space="preserve">Los bienes ofertados son nuevos, sin uso y sin reconstruir (numeral 2.3).</w:t>
-            </w:r>
-          </w:p>
-        </w:tc>
-      </w:tr>
-      <w:tr>
-        <w:tc>
-          <w:tcPr>
-            <w:tcW w:type="dxa" w:w="300"/>
-            <w:tcBorders>
-              <w:top w:val="none" w:color="FFFFFF" w:sz="0"/>
-              <w:left w:val="none" w:color="FFFFFF" w:sz="0"/>
-              <w:bottom w:val="none" w:color="FFFFFF" w:sz="0"/>
-              <w:right w:val="none" w:color="FFFFFF" w:sz="0"/>
-            </w:tcBorders>
-            <w:tcMar>
-              <w:top w:type="dxa" w:w="80"/>
-              <w:left w:type="dxa" w:w="130"/>
-              <w:bottom w:type="dxa" w:w="80"/>
-              <w:right w:type="dxa" w:w="130"/>
-            </w:tcMar>
-            <w:vAlign w:val="top"/>
-          </w:tcPr>
-          <w:p>
-            <w:pPr>
-              <w:spacing w:after="20" w:before="20"/>
-              <w:jc w:val="left"/>
-            </w:pPr>
-            <w:r>
-              <w:rPr>
-                <w:rFonts w:ascii="Arial" w:cs="Arial" w:eastAsia="Arial" w:hAnsi="Arial"/>
-                <w:b w:val="false"/>
-                <w:bCs w:val="false"/>
-                <w:i w:val="false"/>
-                <w:iCs w:val="false"/>
-                <w:caps w:val="false"/>
-                <w:color w:val="EB5A2D"/>
-                <w:sz w:val="12"/>
-                <w:szCs w:val="12"/>
-              </w:rPr>
-              <w:t xml:space="preserve">■</w:t>
-            </w:r>
-          </w:p>
-        </w:tc>
-        <w:tc>
-          <w:tcPr>
-            <w:tcW w:type="dxa" w:w="10500"/>
-            <w:tcBorders>
-              <w:top w:val="none" w:color="FFFFFF" w:sz="0"/>
-              <w:left w:val="none" w:color="FFFFFF" w:sz="0"/>
-              <w:bottom w:val="none" w:color="FFFFFF" w:sz="0"/>
-              <w:right w:val="none" w:color="FFFFFF" w:sz="0"/>
-            </w:tcBorders>
-            <w:tcMar>
-              <w:top w:type="dxa" w:w="80"/>
-              <w:left w:type="dxa" w:w="130"/>
-              <w:bottom w:type="dxa" w:w="80"/>
-              <w:right w:type="dxa" w:w="130"/>
-            </w:tcMar>
-            <w:vAlign w:val="top"/>
-          </w:tcPr>
-          <w:p>
-            <w:pPr>
-              <w:spacing w:after="20" w:before="20"/>
-              <w:jc w:val="both"/>
-            </w:pPr>
-            <w:r>
-              <w:rPr>
-                <w:rFonts w:ascii="Arial" w:cs="Arial" w:eastAsia="Arial" w:hAnsi="Arial"/>
-                <w:b w:val="false"/>
-                <w:bCs w:val="false"/>
-                <w:i w:val="false"/>
-                <w:iCs w:val="false"/>
-                <w:caps w:val="false"/>
-                <w:color w:val="1A1A1A"/>
-                <w:sz w:val="17"/>
-                <w:szCs w:val="17"/>
-              </w:rPr>
-              <w:t xml:space="preserve">Se permiten entregas parciales por renglón adjudicado, únicamente por la totalidad de los artículos solicitados en cada renglón; la facturación será igualmente por renglón completo (numeral 9.6).</w:t>
-            </w:r>
-          </w:p>
-        </w:tc>
-      </w:tr>
-      <w:tr>
-        <w:tc>
-          <w:tcPr>
-            <w:tcW w:type="dxa" w:w="300"/>
-            <w:tcBorders>
-              <w:top w:val="none" w:color="FFFFFF" w:sz="0"/>
-              <w:left w:val="none" w:color="FFFFFF" w:sz="0"/>
-              <w:bottom w:val="none" w:color="FFFFFF" w:sz="0"/>
-              <w:right w:val="none" w:color="FFFFFF" w:sz="0"/>
-            </w:tcBorders>
-            <w:tcMar>
-              <w:top w:type="dxa" w:w="80"/>
-              <w:left w:type="dxa" w:w="130"/>
-              <w:bottom w:type="dxa" w:w="80"/>
-              <w:right w:type="dxa" w:w="130"/>
-            </w:tcMar>
-            <w:vAlign w:val="top"/>
-          </w:tcPr>
-          <w:p>
-            <w:pPr>
-              <w:spacing w:after="20" w:before="20"/>
-              <w:jc w:val="left"/>
-            </w:pPr>
-            <w:r>
-              <w:rPr>
-                <w:rFonts w:ascii="Arial" w:cs="Arial" w:eastAsia="Arial" w:hAnsi="Arial"/>
-                <w:b w:val="false"/>
-                <w:bCs w:val="false"/>
-                <w:i w:val="false"/>
-                <w:iCs w:val="false"/>
-                <w:caps w:val="false"/>
-                <w:color w:val="EB5A2D"/>
-                <w:sz w:val="12"/>
-                <w:szCs w:val="12"/>
-              </w:rPr>
-              <w:t xml:space="preserve">■</w:t>
-            </w:r>
-          </w:p>
-        </w:tc>
-        <w:tc>
-          <w:tcPr>
-            <w:tcW w:type="dxa" w:w="10500"/>
-            <w:tcBorders>
-              <w:top w:val="none" w:color="FFFFFF" w:sz="0"/>
-              <w:left w:val="none" w:color="FFFFFF" w:sz="0"/>
-              <w:bottom w:val="none" w:color="FFFFFF" w:sz="0"/>
-              <w:right w:val="none" w:color="FFFFFF" w:sz="0"/>
-            </w:tcBorders>
-            <w:tcMar>
-              <w:top w:type="dxa" w:w="80"/>
-              <w:left w:type="dxa" w:w="130"/>
-              <w:bottom w:type="dxa" w:w="80"/>
-              <w:right w:type="dxa" w:w="130"/>
-            </w:tcMar>
-            <w:vAlign w:val="top"/>
-          </w:tcPr>
-          <w:p>
-            <w:pPr>
-              <w:spacing w:after="20" w:before="20"/>
-              <w:jc w:val="both"/>
-            </w:pPr>
-            <w:r>
-              <w:rPr>
-                <w:rFonts w:ascii="Arial" w:cs="Arial" w:eastAsia="Arial" w:hAnsi="Arial"/>
-                <w:b w:val="false"/>
-                <w:bCs w:val="false"/>
-                <w:i w:val="false"/>
-                <w:iCs w:val="false"/>
-                <w:caps w:val="false"/>
-                <w:color w:val="1A1A1A"/>
-                <w:sz w:val="17"/>
-                <w:szCs w:val="17"/>
-              </w:rPr>
-              <w:t xml:space="preserve">El proponente acusa recibo de las enmiendas N.° 1 (22-sep-2026) y N.° 2 (30-sep-2026).</w:t>
-            </w:r>
-          </w:p>
-        </w:tc>
-      </w:tr>
-      <w:tr>
-        <w:tc>
-          <w:tcPr>
-            <w:tcW w:type="dxa" w:w="300"/>
-            <w:tcBorders>
-              <w:top w:val="none" w:color="FFFFFF" w:sz="0"/>
-              <w:left w:val="none" w:color="FFFFFF" w:sz="0"/>
-              <w:bottom w:val="none" w:color="FFFFFF" w:sz="0"/>
-              <w:right w:val="none" w:color="FFFFFF" w:sz="0"/>
-            </w:tcBorders>
-            <w:tcMar>
-              <w:top w:type="dxa" w:w="80"/>
-              <w:left w:type="dxa" w:w="130"/>
-              <w:bottom w:type="dxa" w:w="80"/>
-              <w:right w:type="dxa" w:w="130"/>
-            </w:tcMar>
-            <w:vAlign w:val="top"/>
-          </w:tcPr>
-          <w:p>
-            <w:pPr>
-              <w:spacing w:after="20" w:before="20"/>
-              <w:jc w:val="left"/>
-            </w:pPr>
-            <w:r>
-              <w:rPr>
-                <w:rFonts w:ascii="Arial" w:cs="Arial" w:eastAsia="Arial" w:hAnsi="Arial"/>
-                <w:b w:val="false"/>
-                <w:bCs w:val="false"/>
-                <w:i w:val="false"/>
-                <w:iCs w:val="false"/>
-                <w:caps w:val="false"/>
-                <w:color w:val="EB5A2D"/>
-                <w:sz w:val="12"/>
-                <w:szCs w:val="12"/>
-              </w:rPr>
-              <w:t xml:space="preserve">■</w:t>
-            </w:r>
-          </w:p>
-        </w:tc>
-        <w:tc>
-          <w:tcPr>
-            <w:tcW w:type="dxa" w:w="10500"/>
-            <w:tcBorders>
-              <w:top w:val="none" w:color="FFFFFF" w:sz="0"/>
-              <w:left w:val="none" w:color="FFFFFF" w:sz="0"/>
-              <w:bottom w:val="none" w:color="FFFFFF" w:sz="0"/>
-              <w:right w:val="none" w:color="FFFFFF" w:sz="0"/>
-            </w:tcBorders>
-            <w:tcMar>
-              <w:top w:type="dxa" w:w="80"/>
-              <w:left w:type="dxa" w:w="130"/>
-              <w:bottom w:type="dxa" w:w="80"/>
-              <w:right w:type="dxa" w:w="130"/>
-            </w:tcMar>
-            <w:vAlign w:val="top"/>
-          </w:tcPr>
-          <w:p>
-            <w:pPr>
-              <w:spacing w:after="20" w:before="20"/>
-              <w:jc w:val="both"/>
-            </w:pPr>
-            <w:r>
-              <w:rPr>
-                <w:rFonts w:ascii="Arial" w:cs="Arial" w:eastAsia="Arial" w:hAnsi="Arial"/>
-                <w:b w:val="false"/>
-                <w:bCs w:val="false"/>
-                <w:i w:val="false"/>
-                <w:iCs w:val="false"/>
-                <w:caps w:val="false"/>
-                <w:color w:val="1A1A1A"/>
-                <w:sz w:val="17"/>
-                <w:szCs w:val="17"/>
-              </w:rPr>
-              <w:t xml:space="preserve">Condiciones de pago: las establecidas en el pliego de cargos y en las cláusulas 4.28.18 y 4.28.77.</w:t>
             </w:r>
           </w:p>
         </w:tc>

</xml_diff>

<commit_message>
Licitacion 215088: cargar los precios cotizados en la propuesta economica
Co-Authored-By: Claude Opus 5 <noreply@anthropic.com>
Claude-Session: https://claude.ai/code/session_01EKNGokwqz1csBHm9s8jAFm
</commit_message>
<xml_diff>
--- a/licitaciones/215088-guantes-acp/word/PROPUESTA-ECONOMICA-215088.docx
+++ b/licitaciones/215088-guantes-acp/word/PROPUESTA-ECONOMICA-215088.docx
@@ -1000,18 +1000,21 @@
           <w:p>
             <w:pPr>
               <w:spacing w:after="20" w:before="20"/>
-            </w:pPr>
-            <w:r>
-              <w:rPr>
-                <w:rFonts w:ascii="Arial" w:cs="Arial" w:eastAsia="Arial" w:hAnsi="Arial"/>
-                <w:b/>
-                <w:bCs/>
-                <w:color w:val="2F5BA8"/>
-                <w:sz w:val="19"/>
-                <w:szCs w:val="19"/>
-                <w:u w:val="single"/>
-              </w:rPr>
-              <w:t xml:space="preserve">                    </w:t>
+              <w:jc w:val="left"/>
+            </w:pPr>
+            <w:r>
+              <w:rPr>
+                <w:rFonts w:ascii="Arial" w:cs="Arial" w:eastAsia="Arial" w:hAnsi="Arial"/>
+                <w:b w:val="false"/>
+                <w:bCs w:val="false"/>
+                <w:i w:val="false"/>
+                <w:iCs w:val="false"/>
+                <w:caps w:val="false"/>
+                <w:color w:val="1A1A1A"/>
+                <w:sz w:val="18"/>
+                <w:szCs w:val="18"/>
+              </w:rPr>
+              <w:t xml:space="preserve">US$ 1.14</w:t>
             </w:r>
           </w:p>
         </w:tc>
@@ -1065,18 +1068,21 @@
           <w:p>
             <w:pPr>
               <w:spacing w:after="20" w:before="20"/>
-            </w:pPr>
-            <w:r>
-              <w:rPr>
-                <w:rFonts w:ascii="Arial" w:cs="Arial" w:eastAsia="Arial" w:hAnsi="Arial"/>
-                <w:b/>
-                <w:bCs/>
-                <w:color w:val="2F5BA8"/>
-                <w:sz w:val="19"/>
-                <w:szCs w:val="19"/>
-                <w:u w:val="single"/>
-              </w:rPr>
-              <w:t xml:space="preserve">                    </w:t>
+              <w:jc w:val="left"/>
+            </w:pPr>
+            <w:r>
+              <w:rPr>
+                <w:rFonts w:ascii="Arial" w:cs="Arial" w:eastAsia="Arial" w:hAnsi="Arial"/>
+                <w:b w:val="false"/>
+                <w:bCs w:val="false"/>
+                <w:i w:val="false"/>
+                <w:iCs w:val="false"/>
+                <w:caps w:val="false"/>
+                <w:color w:val="1A1A1A"/>
+                <w:sz w:val="18"/>
+                <w:szCs w:val="18"/>
+              </w:rPr>
+              <w:t xml:space="preserve">US$ 1,710.00</w:t>
             </w:r>
           </w:p>
         </w:tc>
@@ -1819,18 +1825,21 @@
           <w:p>
             <w:pPr>
               <w:spacing w:after="20" w:before="20"/>
-            </w:pPr>
-            <w:r>
-              <w:rPr>
-                <w:rFonts w:ascii="Arial" w:cs="Arial" w:eastAsia="Arial" w:hAnsi="Arial"/>
-                <w:b/>
-                <w:bCs/>
-                <w:color w:val="2F5BA8"/>
-                <w:sz w:val="19"/>
-                <w:szCs w:val="19"/>
-                <w:u w:val="single"/>
-              </w:rPr>
-              <w:t xml:space="preserve">                    </w:t>
+              <w:jc w:val="left"/>
+            </w:pPr>
+            <w:r>
+              <w:rPr>
+                <w:rFonts w:ascii="Arial" w:cs="Arial" w:eastAsia="Arial" w:hAnsi="Arial"/>
+                <w:b w:val="false"/>
+                <w:bCs w:val="false"/>
+                <w:i w:val="false"/>
+                <w:iCs w:val="false"/>
+                <w:caps w:val="false"/>
+                <w:color w:val="1A1A1A"/>
+                <w:sz w:val="18"/>
+                <w:szCs w:val="18"/>
+              </w:rPr>
+              <w:t xml:space="preserve">US$ 7.69</w:t>
             </w:r>
           </w:p>
         </w:tc>
@@ -1884,18 +1893,21 @@
           <w:p>
             <w:pPr>
               <w:spacing w:after="20" w:before="20"/>
-            </w:pPr>
-            <w:r>
-              <w:rPr>
-                <w:rFonts w:ascii="Arial" w:cs="Arial" w:eastAsia="Arial" w:hAnsi="Arial"/>
-                <w:b/>
-                <w:bCs/>
-                <w:color w:val="2F5BA8"/>
-                <w:sz w:val="19"/>
-                <w:szCs w:val="19"/>
-                <w:u w:val="single"/>
-              </w:rPr>
-              <w:t xml:space="preserve">                    </w:t>
+              <w:jc w:val="left"/>
+            </w:pPr>
+            <w:r>
+              <w:rPr>
+                <w:rFonts w:ascii="Arial" w:cs="Arial" w:eastAsia="Arial" w:hAnsi="Arial"/>
+                <w:b w:val="false"/>
+                <w:bCs w:val="false"/>
+                <w:i w:val="false"/>
+                <w:iCs w:val="false"/>
+                <w:caps w:val="false"/>
+                <w:color w:val="1A1A1A"/>
+                <w:sz w:val="18"/>
+                <w:szCs w:val="18"/>
+              </w:rPr>
+              <w:t xml:space="preserve">US$ 7,382.40</w:t>
             </w:r>
           </w:p>
         </w:tc>
@@ -2638,18 +2650,21 @@
           <w:p>
             <w:pPr>
               <w:spacing w:after="20" w:before="20"/>
-            </w:pPr>
-            <w:r>
-              <w:rPr>
-                <w:rFonts w:ascii="Arial" w:cs="Arial" w:eastAsia="Arial" w:hAnsi="Arial"/>
-                <w:b/>
-                <w:bCs/>
-                <w:color w:val="2F5BA8"/>
-                <w:sz w:val="19"/>
-                <w:szCs w:val="19"/>
-                <w:u w:val="single"/>
-              </w:rPr>
-              <w:t xml:space="preserve">                    </w:t>
+              <w:jc w:val="left"/>
+            </w:pPr>
+            <w:r>
+              <w:rPr>
+                <w:rFonts w:ascii="Arial" w:cs="Arial" w:eastAsia="Arial" w:hAnsi="Arial"/>
+                <w:b w:val="false"/>
+                <w:bCs w:val="false"/>
+                <w:i w:val="false"/>
+                <w:iCs w:val="false"/>
+                <w:caps w:val="false"/>
+                <w:color w:val="1A1A1A"/>
+                <w:sz w:val="18"/>
+                <w:szCs w:val="18"/>
+              </w:rPr>
+              <w:t xml:space="preserve">US$ 9.60</w:t>
             </w:r>
           </w:p>
         </w:tc>
@@ -2703,18 +2718,21 @@
           <w:p>
             <w:pPr>
               <w:spacing w:after="20" w:before="20"/>
-            </w:pPr>
-            <w:r>
-              <w:rPr>
-                <w:rFonts w:ascii="Arial" w:cs="Arial" w:eastAsia="Arial" w:hAnsi="Arial"/>
-                <w:b/>
-                <w:bCs/>
-                <w:color w:val="2F5BA8"/>
-                <w:sz w:val="19"/>
-                <w:szCs w:val="19"/>
-                <w:u w:val="single"/>
-              </w:rPr>
-              <w:t xml:space="preserve">                    </w:t>
+              <w:jc w:val="left"/>
+            </w:pPr>
+            <w:r>
+              <w:rPr>
+                <w:rFonts w:ascii="Arial" w:cs="Arial" w:eastAsia="Arial" w:hAnsi="Arial"/>
+                <w:b w:val="false"/>
+                <w:bCs w:val="false"/>
+                <w:i w:val="false"/>
+                <w:iCs w:val="false"/>
+                <w:caps w:val="false"/>
+                <w:color w:val="1A1A1A"/>
+                <w:sz w:val="18"/>
+                <w:szCs w:val="18"/>
+              </w:rPr>
+              <w:t xml:space="preserve">US$ 9,600.00</w:t>
             </w:r>
           </w:p>
         </w:tc>
@@ -3457,18 +3475,21 @@
           <w:p>
             <w:pPr>
               <w:spacing w:after="20" w:before="20"/>
-            </w:pPr>
-            <w:r>
-              <w:rPr>
-                <w:rFonts w:ascii="Arial" w:cs="Arial" w:eastAsia="Arial" w:hAnsi="Arial"/>
-                <w:b/>
-                <w:bCs/>
-                <w:color w:val="2F5BA8"/>
-                <w:sz w:val="19"/>
-                <w:szCs w:val="19"/>
-                <w:u w:val="single"/>
-              </w:rPr>
-              <w:t xml:space="preserve">                    </w:t>
+              <w:jc w:val="left"/>
+            </w:pPr>
+            <w:r>
+              <w:rPr>
+                <w:rFonts w:ascii="Arial" w:cs="Arial" w:eastAsia="Arial" w:hAnsi="Arial"/>
+                <w:b w:val="false"/>
+                <w:bCs w:val="false"/>
+                <w:i w:val="false"/>
+                <w:iCs w:val="false"/>
+                <w:caps w:val="false"/>
+                <w:color w:val="1A1A1A"/>
+                <w:sz w:val="18"/>
+                <w:szCs w:val="18"/>
+              </w:rPr>
+              <w:t xml:space="preserve">US$ 4.69</w:t>
             </w:r>
           </w:p>
         </w:tc>
@@ -3522,18 +3543,21 @@
           <w:p>
             <w:pPr>
               <w:spacing w:after="20" w:before="20"/>
-            </w:pPr>
-            <w:r>
-              <w:rPr>
-                <w:rFonts w:ascii="Arial" w:cs="Arial" w:eastAsia="Arial" w:hAnsi="Arial"/>
-                <w:b/>
-                <w:bCs/>
-                <w:color w:val="2F5BA8"/>
-                <w:sz w:val="19"/>
-                <w:szCs w:val="19"/>
-                <w:u w:val="single"/>
-              </w:rPr>
-              <w:t xml:space="preserve">                    </w:t>
+              <w:jc w:val="left"/>
+            </w:pPr>
+            <w:r>
+              <w:rPr>
+                <w:rFonts w:ascii="Arial" w:cs="Arial" w:eastAsia="Arial" w:hAnsi="Arial"/>
+                <w:b w:val="false"/>
+                <w:bCs w:val="false"/>
+                <w:i w:val="false"/>
+                <w:iCs w:val="false"/>
+                <w:caps w:val="false"/>
+                <w:color w:val="1A1A1A"/>
+                <w:sz w:val="18"/>
+                <w:szCs w:val="18"/>
+              </w:rPr>
+              <w:t xml:space="preserve">US$ 23,450.00</w:t>
             </w:r>
           </w:p>
         </w:tc>
@@ -4276,18 +4300,21 @@
           <w:p>
             <w:pPr>
               <w:spacing w:after="20" w:before="20"/>
-            </w:pPr>
-            <w:r>
-              <w:rPr>
-                <w:rFonts w:ascii="Arial" w:cs="Arial" w:eastAsia="Arial" w:hAnsi="Arial"/>
-                <w:b/>
-                <w:bCs/>
-                <w:color w:val="2F5BA8"/>
-                <w:sz w:val="19"/>
-                <w:szCs w:val="19"/>
-                <w:u w:val="single"/>
-              </w:rPr>
-              <w:t xml:space="preserve">                    </w:t>
+              <w:jc w:val="left"/>
+            </w:pPr>
+            <w:r>
+              <w:rPr>
+                <w:rFonts w:ascii="Arial" w:cs="Arial" w:eastAsia="Arial" w:hAnsi="Arial"/>
+                <w:b w:val="false"/>
+                <w:bCs w:val="false"/>
+                <w:i w:val="false"/>
+                <w:iCs w:val="false"/>
+                <w:caps w:val="false"/>
+                <w:color w:val="1A1A1A"/>
+                <w:sz w:val="18"/>
+                <w:szCs w:val="18"/>
+              </w:rPr>
+              <w:t xml:space="preserve">US$ 2.89</w:t>
             </w:r>
           </w:p>
         </w:tc>
@@ -4341,18 +4368,21 @@
           <w:p>
             <w:pPr>
               <w:spacing w:after="20" w:before="20"/>
-            </w:pPr>
-            <w:r>
-              <w:rPr>
-                <w:rFonts w:ascii="Arial" w:cs="Arial" w:eastAsia="Arial" w:hAnsi="Arial"/>
-                <w:b/>
-                <w:bCs/>
-                <w:color w:val="2F5BA8"/>
-                <w:sz w:val="19"/>
-                <w:szCs w:val="19"/>
-                <w:u w:val="single"/>
-              </w:rPr>
-              <w:t xml:space="preserve">                    </w:t>
+              <w:jc w:val="left"/>
+            </w:pPr>
+            <w:r>
+              <w:rPr>
+                <w:rFonts w:ascii="Arial" w:cs="Arial" w:eastAsia="Arial" w:hAnsi="Arial"/>
+                <w:b w:val="false"/>
+                <w:bCs w:val="false"/>
+                <w:i w:val="false"/>
+                <w:iCs w:val="false"/>
+                <w:caps w:val="false"/>
+                <w:color w:val="1A1A1A"/>
+                <w:sz w:val="18"/>
+                <w:szCs w:val="18"/>
+              </w:rPr>
+              <w:t xml:space="preserve">US$ 2,601.00</w:t>
             </w:r>
           </w:p>
         </w:tc>

</xml_diff>